<commit_message>
feat: add travel drive C motor replacement procedure and update handoff
</commit_message>
<xml_diff>
--- a/docs/report/01_Battery_HVAC_Tests/Preparing_HVAC_OFF/bms_preparing_hvac_off_report.docx
+++ b/docs/report/01_Battery_HVAC_Tests/Preparing_HVAC_OFF/bms_preparing_hvac_off_report.docx
@@ -54,7 +54,13 @@
         <w:t xml:space="preserve">Vehicle Model: </w:t>
       </w:r>
       <w:r>
-        <w:t>Isoloader MJ35 Gantry Crane</w:t>
+        <w:t xml:space="preserve">Isoloader MJ35 </w:t>
+      </w:r>
+      <w:r>
+        <w:t>Straddle</w:t>
+      </w:r>
+      <w:r>
+        <w:t xml:space="preserve"> Crane</w:t>
       </w:r>
       <w:r>
         <w:br/>
@@ -767,7 +773,7 @@
           <w:noProof/>
         </w:rPr>
         <w:drawing>
-          <wp:inline distT="0" distB="0" distL="0" distR="0" wp14:anchorId="4386ECF5" wp14:editId="2A3D522A">
+          <wp:inline distT="0" distB="0" distL="0" distR="0" wp14:anchorId="1F29F3B3" wp14:editId="2776DA81">
             <wp:extent cx="5486400" cy="2194560"/>
             <wp:effectExtent l="0" t="0" r="0" b="0"/>
             <wp:docPr id="1" name="Picture 1"/>
@@ -817,7 +823,7 @@
           <w:noProof/>
         </w:rPr>
         <w:drawing>
-          <wp:inline distT="0" distB="0" distL="0" distR="0" wp14:anchorId="0D85E2F6" wp14:editId="6460B8B4">
+          <wp:inline distT="0" distB="0" distL="0" distR="0" wp14:anchorId="15A9591A" wp14:editId="1CCBE831">
             <wp:extent cx="5486400" cy="2194560"/>
             <wp:effectExtent l="0" t="0" r="0" b="0"/>
             <wp:docPr id="2" name="Picture 2"/>
@@ -867,7 +873,7 @@
           <w:noProof/>
         </w:rPr>
         <w:drawing>
-          <wp:inline distT="0" distB="0" distL="0" distR="0" wp14:anchorId="6D9ABA36" wp14:editId="63E6AE3D">
+          <wp:inline distT="0" distB="0" distL="0" distR="0" wp14:anchorId="5597624C" wp14:editId="2BA2F289">
             <wp:extent cx="5486400" cy="2194560"/>
             <wp:effectExtent l="0" t="0" r="0" b="0"/>
             <wp:docPr id="3" name="Picture 3"/>
@@ -918,7 +924,7 @@
           <w:noProof/>
         </w:rPr>
         <w:drawing>
-          <wp:inline distT="0" distB="0" distL="0" distR="0" wp14:anchorId="23B7477C" wp14:editId="493E140C">
+          <wp:inline distT="0" distB="0" distL="0" distR="0" wp14:anchorId="253F49BD" wp14:editId="07FC9495">
             <wp:extent cx="4572000" cy="2286000"/>
             <wp:effectExtent l="0" t="0" r="0" b="0"/>
             <wp:docPr id="4" name="Picture 4"/>
@@ -963,12 +969,17 @@
       </w:r>
     </w:p>
     <w:p>
+      <w:pPr>
+        <w:rPr>
+          <w:lang w:val="vi-VN"/>
+        </w:rPr>
+      </w:pPr>
       <w:r>
         <w:rPr>
           <w:noProof/>
         </w:rPr>
         <w:drawing>
-          <wp:inline distT="0" distB="0" distL="0" distR="0" wp14:anchorId="6D93EC72" wp14:editId="5EE2B451">
+          <wp:inline distT="0" distB="0" distL="0" distR="0" wp14:anchorId="7FDCBF17" wp14:editId="529BC094">
             <wp:extent cx="5486400" cy="2194560"/>
             <wp:effectExtent l="0" t="0" r="0" b="0"/>
             <wp:docPr id="5" name="Picture 5"/>
@@ -1002,55 +1013,6 @@
             </a:graphic>
           </wp:inline>
         </w:drawing>
-      </w:r>
-    </w:p>
-    <w:p>
-      <w:pPr>
-        <w:pStyle w:val="Heading1"/>
-      </w:pPr>
-      <w:r>
-        <w:t>4. Engineering Recommendations</w:t>
-      </w:r>
-    </w:p>
-    <w:p>
-      <w:r>
-        <w:rPr>
-          <w:b/>
-        </w:rPr>
-        <w:t xml:space="preserve">1. Contactor Lifetime Preservation: </w:t>
-      </w:r>
-      <w:r>
-        <w:t>Under Preparing state, the small load is safe, but verify that pre-charging pulses (the current spikes up to 4.5A) do not cause contactor degradation over time.</w:t>
-      </w:r>
-      <w:r>
-        <w:br/>
-      </w:r>
-      <w:r>
-        <w:br/>
-      </w:r>
-      <w:r>
-        <w:rPr>
-          <w:b/>
-        </w:rPr>
-        <w:t xml:space="preserve">2. HVAC Impact: </w:t>
-      </w:r>
-      <w:r>
-        <w:t>The air conditioning consumes about ~3.37 kW constantly. This represents a significant load during standby (representing about 91% of standby power). Operators should be trained to turn OFF the HVAC when the crane is parked in preparing state for long periods to conserve battery energy.</w:t>
-      </w:r>
-      <w:r>
-        <w:br/>
-      </w:r>
-      <w:r>
-        <w:br/>
-      </w:r>
-      <w:r>
-        <w:rPr>
-          <w:b/>
-        </w:rPr>
-        <w:t xml:space="preserve">3. SOC Balanced Discharging: </w:t>
-      </w:r>
-      <w:r>
-        <w:t>As observed in the plots, both Pack A and Pack B discharge symmetrically, showing excellent parallel load balancing and cells health.</w:t>
       </w:r>
     </w:p>
     <w:sectPr>
@@ -1140,21 +1102,12 @@
       <w:pStyle w:val="Header"/>
       <w:jc w:val="right"/>
     </w:pPr>
-    <w:proofErr w:type="spellStart"/>
     <w:r>
       <w:rPr>
         <w:color w:val="808080"/>
         <w:sz w:val="17"/>
       </w:rPr>
-      <w:t>Isoloader</w:t>
-    </w:r>
-    <w:proofErr w:type="spellEnd"/>
-    <w:r>
-      <w:rPr>
-        <w:color w:val="808080"/>
-        <w:sz w:val="17"/>
-      </w:rPr>
-      <w:t xml:space="preserve"> MJ35 Battery Performance Report | Preparing State - HVAC OFF</w:t>
+      <w:t>Isoloader MJ35 Battery Performance Report | Preparing State - HVAC OFF</w:t>
     </w:r>
   </w:p>
 </w:hdr>
@@ -1333,31 +1286,31 @@
       </w:rPr>
     </w:lvl>
   </w:abstractNum>
-  <w:num w:numId="1" w16cid:durableId="680552262">
+  <w:num w:numId="1" w16cid:durableId="968508318">
     <w:abstractNumId w:val="8"/>
   </w:num>
-  <w:num w:numId="2" w16cid:durableId="1695110547">
+  <w:num w:numId="2" w16cid:durableId="1557543089">
     <w:abstractNumId w:val="6"/>
   </w:num>
-  <w:num w:numId="3" w16cid:durableId="1751385410">
+  <w:num w:numId="3" w16cid:durableId="1921451517">
     <w:abstractNumId w:val="5"/>
   </w:num>
-  <w:num w:numId="4" w16cid:durableId="1581480875">
+  <w:num w:numId="4" w16cid:durableId="1795176243">
     <w:abstractNumId w:val="4"/>
   </w:num>
-  <w:num w:numId="5" w16cid:durableId="2020351348">
+  <w:num w:numId="5" w16cid:durableId="835728404">
     <w:abstractNumId w:val="7"/>
   </w:num>
-  <w:num w:numId="6" w16cid:durableId="815605408">
+  <w:num w:numId="6" w16cid:durableId="1043558884">
     <w:abstractNumId w:val="3"/>
   </w:num>
-  <w:num w:numId="7" w16cid:durableId="190075844">
+  <w:num w:numId="7" w16cid:durableId="719404846">
     <w:abstractNumId w:val="2"/>
   </w:num>
-  <w:num w:numId="8" w16cid:durableId="928924437">
+  <w:num w:numId="8" w16cid:durableId="1598831730">
     <w:abstractNumId w:val="1"/>
   </w:num>
-  <w:num w:numId="9" w16cid:durableId="1612860294">
+  <w:num w:numId="9" w16cid:durableId="1287928286">
     <w:abstractNumId w:val="0"/>
   </w:num>
 </w:numbering>

</xml_diff>